<commit_message>
Consistency and technical revision round for Ch1-8
- Fix stale forward references to Ch7/Ch8 (now drafted, not pending)
- Soften overclaimed identifiability-restoration language in intro
- Downgrade Table 4/5 Bayesian/state-space parameter-identifiability and
  state-observability cells from checkmark to hedged warning
- Name and cite the two previously-unnamed Monte Carlo studies in Sec 8.7
  (Pei et al. 2016; Croft et al. 2020), added as refs [49]-[50]
- Resolve Alhassan et al. citation year ambiguity (2025/2026 -> 2025)
- Renumber Figures 2-4 to 1-3 for caption continuity (no Figure 1 existed)
- Add missing companion .md files and Figure 1 (formerly Fig2) to repo
- Add Evidence Freeze Audit documenting per-chapter reference composition
  and full-text-read status
- Apply narrower page margins and re-verify OMML math/table/figure
  structure in generated docx files
</commit_message>
<xml_diff>
--- a/wbe-review/WBE_Review_Ch1-8.docx
+++ b/wbe-review/WBE_Review_Ch1-8.docx
@@ -329,7 +329,7 @@
         <w:t xml:space="preserve"> </w:t>
       </w:r>
       <w:r>
-        <w:t xml:space="preserve">— using mechanistic models of excretion, transport, and decay, rather than purely statistical normalization, to reduce the space of admissible solutions — is what restores it. These five concepts (amplitude, temporal, and spatial distortion; identifiability; process-informed correction) are introduced formally in Section 3 and used as the organizing vocabulary for Sections 3–6, and — in later chapters not yet drafted — 7 and 8.</w:t>
+        <w:t xml:space="preserve">— using mechanistic models of excretion, transport, and decay, rather than purely statistical normalization, to reduce the space of admissible solutions — and independent auxiliary information may narrow the admissible solution space, but they cannot guarantee identifiability or recover information irreversibly lost during transport, sampling, or aggregation (§7.0, §7.3, §8.0). These five concepts (amplitude, temporal, and spatial distortion; identifiability; process-informed correction) are introduced formally in Section 3 and used as the organizing vocabulary throughout Sections 3–8.</w:t>
       </w:r>
     </w:p>
     <w:p>
@@ -381,7 +381,7 @@
         <w:pStyle w:val="FirstParagraph"/>
       </w:pPr>
       <w:r>
-        <w:t xml:space="preserve">Section 2 describes this review’s methodology and evidence base, including an honest account of its current limitations. Section 3 develops the source-to-sample signal-formation chain as a formal inverse problem. Section 4 addresses in-sewer transformation and rainfall/seasonal distortion — the review’s mechanistic core — and closes by connecting distortion back to identifiability and process-informed correction. Section 5 extends the same inverse-problem framework through sampling and analytical uncertainty. Section 6 addresses normalization — flow-, population-, and biomarker-based — as a further correction step applied to the already-doubly-distorted reported signal, and argues that normalization is not itself a reconstruction of the source state but a conditionally valid statistical adjustment whose validity must be checked rather than assumed. Later sections (to be drafted) will cover back-calculation and modeling approaches (§7), a formal uncertainty-propagation framework (§8), translation to public health decisions and equity (§9), emerging multi-omics/AI directions (§10), research gaps (§11), and conclusions (§12).</w:t>
+        <w:t xml:space="preserve">Section 2 describes this review’s methodology and evidence base, including an honest account of its current limitations. Section 3 develops the source-to-sample signal-formation chain as a formal inverse problem. Section 4 addresses in-sewer transformation and rainfall/seasonal distortion — the review’s mechanistic core — and closes by connecting distortion back to identifiability and process-informed correction. Section 5 extends the same inverse-problem framework through sampling and analytical uncertainty. Section 6 addresses normalization — flow-, population-, and biomarker-based — as a further correction step applied to the already-doubly-distorted reported signal, and argues that normalization is not itself a reconstruction of the source state but a conditionally valid statistical adjustment whose validity must be checked rather than assumed. Section 7 develops back-calculation, identifiability, and validation as a formal five-way methodological distinction, and Section 8 develops a formal uncertainty-propagation framework spanning source variability to decision uncertainty. Sections 9–12 remain to be drafted: translation to public health decisions and equity (§9), emerging multi-omics/AI directions (§10), research gaps (§11), and conclusions (§12).</w:t>
       </w:r>
     </w:p>
     <w:p>
@@ -12994,7 +12994,7 @@
         <w:pStyle w:val="FirstParagraph"/>
       </w:pPr>
       <w:r>
-        <w:t xml:space="preserve">The following eight questions, asked in sequence, structure the target-type/purpose-specific selection this chapter has argued for (§6.7), and are designed to be redrawable as a flowchart (Figure 2, described below) rather than applied as free-form prose:</w:t>
+        <w:t xml:space="preserve">The following eight questions, asked in sequence, structure the target-type/purpose-specific selection this chapter has argued for (§6.7), and are designed to be redrawable as a flowchart (Figure 1, described below) rather than applied as free-form prose:</w:t>
       </w:r>
     </w:p>
     <w:p>
@@ -13280,14 +13280,14 @@
       <w:r>
         <w:drawing>
           <wp:inline>
-            <wp:extent cx="5334000" cy="4225273"/>
+            <wp:extent cx="6667500" cy="5281591"/>
             <wp:effectExtent b="0" l="0" r="0" t="0"/>
-            <wp:docPr descr="Figure 2. Decision tree for purpose- and target-specific normalization, rendering the eight-question sequence above." title="" id="55" name="Picture"/>
+            <wp:docPr descr="Figure 1. Decision tree for purpose- and target-specific normalization, rendering the eight-question sequence above." title="" id="55" name="Picture"/>
             <a:graphic>
               <a:graphicData uri="http://schemas.openxmlformats.org/drawingml/2006/picture">
                 <pic:pic>
                   <pic:nvPicPr>
-                    <pic:cNvPr descr="WBE_Fig2_Normalization_Decision_Tree.png" id="56" name="Picture"/>
+                    <pic:cNvPr descr="WBE_Fig1_Normalization_Decision_Tree.png" id="56" name="Picture"/>
                     <pic:cNvPicPr>
                       <a:picLocks noChangeArrowheads="1" noChangeAspect="1"/>
                     </pic:cNvPicPr>
@@ -13301,7 +13301,7 @@
                   <pic:spPr bwMode="auto">
                     <a:xfrm>
                       <a:off x="0" y="0"/>
-                      <a:ext cx="5334000" cy="4225273"/>
+                      <a:ext cx="6667500" cy="5281591"/>
                     </a:xfrm>
                     <a:prstGeom prst="rect">
                       <a:avLst/>
@@ -13325,7 +13325,7 @@
         <w:pStyle w:val="ImageCaption"/>
       </w:pPr>
       <w:r>
-        <w:t xml:space="preserve">Figure 2. Decision tree for purpose- and target-specific normalization, rendering the eight-question sequence above.</w:t>
+        <w:t xml:space="preserve">Figure 1. Decision tree for purpose- and target-specific normalization, rendering the eight-question sequence above.</w:t>
       </w:r>
     </w:p>
     <w:p>
@@ -13352,7 +13352,7 @@
           <w:iCs/>
           <w:i/>
         </w:rPr>
-        <w:t xml:space="preserve">WBE_Fig2_Normalization_Decision_Tree.png</w:t>
+        <w:t xml:space="preserve">WBE_Fig1_Normalization_Decision_Tree.png</w:t>
       </w:r>
       <w:r>
         <w:rPr>
@@ -15017,7 +15017,7 @@
         <w:t xml:space="preserve"> </w:t>
       </w:r>
       <w:r>
-        <w:t xml:space="preserve">— combining multiple models or multiple data streams within a single estimation or comparison framework, on the premise that distortions and gaps in any one model or data stream can be partially compensated by independent information in another. A retrospective U.S. national study compared 11 forecasting models (ARIMA, generalized additive models, simple linear regression, Prophet, and an n-sub-epidemic ensemble framework) applied to CDC wastewater surveillance data across a 2022–2024 window, evaluating predictive performance across the ensemble (Alhassan, Karami, Bleichrodt, Hyman, Fung, Luo, &amp; Chowell, 2025/2026 arXiv preprint; specific model-ranking figures pending full-text confirmation).</w:t>
+        <w:t xml:space="preserve">— combining multiple models or multiple data streams within a single estimation or comparison framework, on the premise that distortions and gaps in any one model or data stream can be partially compensated by independent information in another. A retrospective U.S. national study compared 11 forecasting models (ARIMA, generalized additive models, simple linear regression, Prophet, and an n-sub-epidemic ensemble framework) applied to CDC wastewater surveillance data across a 2022–2024 window, evaluating predictive performance across the ensemble (Alhassan, Karami, Bleichrodt, Hyman, Fung, Luo, &amp; Chowell, 2025 arXiv preprint; specific model-ranking figures pending full-text confirmation).</w:t>
       </w:r>
       <w:r>
         <w:t xml:space="preserve"> </w:t>
@@ -17421,19 +17421,19 @@
               <w:jc w:val="left"/>
             </w:pPr>
             <w:r>
-              <w:t xml:space="preserve">✅ (posterior intervals directly quantify this)</w:t>
-            </w:r>
-          </w:p>
-        </w:tc>
-        <w:tc>
-          <w:tcPr/>
-          <w:p>
-            <w:pPr>
-              <w:pStyle w:val="Compact"/>
-              <w:jc w:val="left"/>
-            </w:pPr>
-            <w:r>
-              <w:t xml:space="preserve">✅ explicit latent-state design, though posterior width reflects rather than guarantees resolution — a flat/multimodal posterior is itself diagnostic</w:t>
+              <w:t xml:space="preserve">⚠ a posterior credible interval describes parameter uncertainty conditional on the chosen model and prior — it is not, by itself, evidence of structural or practical identifiability (§8.9’s narrow-posterior critique); a narrow interval can result from an informative/overconfident prior or an overly rigid model structure rather than genuine identifiability, so this requires independent structural/practical identifiability diagnostics (§7.3) before being read as ✅</w:t>
+            </w:r>
+          </w:p>
+        </w:tc>
+        <w:tc>
+          <w:tcPr/>
+          <w:p>
+            <w:pPr>
+              <w:pStyle w:val="Compact"/>
+              <w:jc w:val="left"/>
+            </w:pPr>
+            <w:r>
+              <w:t xml:space="preserve">⚠ explicitly models a latent state and provides posterior state estimates, but this does not by itself establish state observability — no formal observability analysis or synthetic-state/known-truth recovery test was confirmed for this study, so posterior state estimates should not be equated with demonstrated observability</w:t>
             </w:r>
           </w:p>
         </w:tc>
@@ -17607,7 +17607,7 @@
               <w:jc w:val="left"/>
             </w:pPr>
             <w:r>
-              <w:t xml:space="preserve">Multi-model ensembles (e.g., Alhassan et al., 2025/2026)</w:t>
+              <w:t xml:space="preserve">Multi-model ensembles (e.g., Alhassan et al., 2025)</w:t>
             </w:r>
           </w:p>
         </w:tc>
@@ -18441,19 +18441,19 @@
               <w:jc w:val="left"/>
             </w:pPr>
             <w:r>
-              <w:t xml:space="preserve">n/a (Bayesian framework; identifiability not the stated focus)</w:t>
-            </w:r>
-          </w:p>
-        </w:tc>
-        <w:tc>
-          <w:tcPr/>
-          <w:p>
-            <w:pPr>
-              <w:pStyle w:val="Compact"/>
-              <w:jc w:val="left"/>
-            </w:pPr>
-            <w:r>
-              <w:t xml:space="preserve">✅ yes — explicit functional-data latent-process design addresses missingness and state recovery directly</w:t>
+              <w:t xml:space="preserve">⚠ not applicable in the classical sense (Bayesian framework, identifiability not the stated focus), and a posterior interval alone does not establish it (§7.0, §8.9)</w:t>
+            </w:r>
+          </w:p>
+        </w:tc>
+        <w:tc>
+          <w:tcPr/>
+          <w:p>
+            <w:pPr>
+              <w:pStyle w:val="Compact"/>
+              <w:jc w:val="left"/>
+            </w:pPr>
+            <w:r>
+              <w:t xml:space="preserve">⚠ explicitly models a latent process and reports posterior state estimates addressing missingness, but no formal observability or synthetic-state recovery test was confirmed — posterior estimates alone are not equated with demonstrated observability</w:t>
             </w:r>
           </w:p>
         </w:tc>
@@ -18711,7 +18711,7 @@
               <w:jc w:val="left"/>
             </w:pPr>
             <w:r>
-              <w:t xml:space="preserve">Alhassan et al. (2025/2026)</w:t>
+              <w:t xml:space="preserve">Alhassan et al. (2025)</w:t>
             </w:r>
           </w:p>
         </w:tc>
@@ -22511,7 +22511,7 @@
         <w:pStyle w:val="FirstParagraph"/>
       </w:pPr>
       <w:r>
-        <w:t xml:space="preserve">The standard simulation-based alternative: (1) specify a probability distribution for every uncertain input; (2) preserve known correlation structure among inputs rather than assuming independence (§8.10); (3) repeatedly sample from the joint input distribution and propagate each draw through the forward (or inverse) model; (4) collect the resulting distribution of outputs; (5) report medians, quantiles, and exceedance probabilities rather than a single point estimate plus symmetric error bar. Monte Carlo methods have a genuine track record in the chemical-WBE consumption-estimation literature specifically — beyond the formal Bayesian framework already discussed (Jones et al., 2014), Monte Carlo simulation has been applied directly to estimate uncertainty and variability in methamphetamine consumption and prevalence, and separately to neuropsychiatric drug prevalence estimates across multiple communities, from wastewater biomarker data (search identified these as real, distinct primary studies in this literature; specific author lists and quantitative findings not independently confirmed this session — flagged in the verification table as a documented category of chemical-WBE Monte Carlo studies, not a single fully-verified citation).</w:t>
+        <w:t xml:space="preserve">The standard simulation-based alternative: (1) specify a probability distribution for every uncertain input; (2) preserve known correlation structure among inputs rather than assuming independence (§8.10); (3) repeatedly sample from the joint input distribution and propagate each draw through the forward (or inverse) model; (4) collect the resulting distribution of outputs; (5) report medians, quantiles, and exceedance probabilities rather than a single point estimate plus symmetric error bar. Monte Carlo methods have a genuine track record in the chemical-WBE consumption-estimation literature specifically — beyond the formal Bayesian framework already discussed (Jones et al., 2014), Monte Carlo simulation (100,000 resampling iterations over the probability distributions assigned to each input parameter) was applied directly to estimate uncertainty and variability in methamphetamine consumption and prevalence in Beijing (Pei, Zhan, Yan, Ge, Zhang, Wang, &amp; Wang, 2016), and, separately, to neuropsychiatric and illicit drug prevalence estimates across three U.S. communities — described as the first application of Monte Carlo uncertainty propagation to WBE prevalence estimation in the U.S. (Croft, Huffines, Pathak, &amp; Subedi, 2020). Both are real, named, primary chemical-WBE Monte Carlo studies; the specific numeric outputs each reports (e.g., Beijing’s median 2.6 kg/day methamphetamine consumption estimate, or the Kentucky per-capita consumption figures) are flagged in the verification table as pending full-text confirmation, consistent with this review’s standing evidentiary caveat, but the studies themselves and their authorship are no longer unnamed.</w:t>
       </w:r>
     </w:p>
     <w:p>
@@ -23582,7 +23582,7 @@
         <w:t xml:space="preserve"> </w:t>
       </w:r>
       <w:r>
-        <w:t xml:space="preserve">— running several plausible model structures and combining their outputs, whether by simple averaging or by performance-weighted combination — is the most direct approach, and the multi-model wastewater-forecasting comparison discussed in §7.1.2/§7.4 (Alhassan et al., 2025/2026) is this review’s clearest WBE example of this practice, though as a retrospective forecast comparison rather than a full structural-uncertainty-quantification exercise per se.</w:t>
+        <w:t xml:space="preserve">— running several plausible model structures and combining their outputs, whether by simple averaging or by performance-weighted combination — is the most direct approach, and the multi-model wastewater-forecasting comparison discussed in §7.1.2/§7.4 (Alhassan et al., 2025) is this review’s clearest WBE example of this practice, though as a retrospective forecast comparison rather than a full structural-uncertainty-quantification exercise per se.</w:t>
       </w:r>
       <w:r>
         <w:t xml:space="preserve"> </w:t>
@@ -23958,7 +23958,7 @@
         <w:t xml:space="preserve"> </w:t>
       </w:r>
       <w:r>
-        <w:t xml:space="preserve">— the original figure this review delivers alongside this chapter (Figure 4, described in the companion materials) — and its practical value is identifying which stage dominates total uncertainty for a</w:t>
+        <w:t xml:space="preserve">— the original figure this review delivers alongside this chapter (Figure 3, described in the companion materials) — and its practical value is identifying which stage dominates total uncertainty for a</w:t>
       </w:r>
       <w:r>
         <w:t xml:space="preserve"> </w:t>
@@ -25943,13 +25943,13 @@
       </w:r>
     </w:p>
     <w:bookmarkEnd w:id="89"/>
-    <w:bookmarkStart w:id="96" w:name="X5b1ce61b214ab7bdc25d01fc31aa0aa5f9eb779"/>
+    <w:bookmarkStart w:id="96" w:name="Xeb8af41a5ccd1b810658a2499499fb481b29523"/>
     <w:p>
       <w:pPr>
         <w:pStyle w:val="Heading3"/>
       </w:pPr>
       <w:r>
-        <w:t xml:space="preserve">Figure 3 and Figure 4 (delivered as separate image files alongside this document)</w:t>
+        <w:t xml:space="preserve">Figure 2 and Figure 3 (delivered as separate image files alongside this document)</w:t>
       </w:r>
     </w:p>
     <w:p>
@@ -25959,14 +25959,14 @@
       <w:r>
         <w:drawing>
           <wp:inline>
-            <wp:extent cx="5334000" cy="2949516"/>
+            <wp:extent cx="6667500" cy="3686895"/>
             <wp:effectExtent b="0" l="0" r="0" t="0"/>
-            <wp:docPr descr="Figure 3. Uncertainty propagation across the source–sewer–measurement–normalization–reconstruction chain, with the §8.13 law-of-total-variance decomposition indicated at each stage." title="" id="91" name="Picture"/>
+            <wp:docPr descr="Figure 2. Uncertainty propagation across the source–sewer–measurement–normalization–reconstruction chain, with the §8.13 law-of-total-variance decomposition indicated at each stage." title="" id="91" name="Picture"/>
             <a:graphic>
               <a:graphicData uri="http://schemas.openxmlformats.org/drawingml/2006/picture">
                 <pic:pic>
                   <pic:nvPicPr>
-                    <pic:cNvPr descr="WBE_Fig3_Uncertainty_Chain.png" id="92" name="Picture"/>
+                    <pic:cNvPr descr="WBE_Fig2_Uncertainty_Chain.png" id="92" name="Picture"/>
                     <pic:cNvPicPr>
                       <a:picLocks noChangeArrowheads="1" noChangeAspect="1"/>
                     </pic:cNvPicPr>
@@ -25980,7 +25980,7 @@
                   <pic:spPr bwMode="auto">
                     <a:xfrm>
                       <a:off x="0" y="0"/>
-                      <a:ext cx="5334000" cy="2949516"/>
+                      <a:ext cx="6667500" cy="3686895"/>
                     </a:xfrm>
                     <a:prstGeom prst="rect">
                       <a:avLst/>
@@ -26004,7 +26004,7 @@
         <w:pStyle w:val="ImageCaption"/>
       </w:pPr>
       <w:r>
-        <w:t xml:space="preserve">Figure 3. Uncertainty propagation across the source–sewer–measurement–normalization–reconstruction chain, with the §8.13 law-of-total-variance decomposition indicated at each stage.</w:t>
+        <w:t xml:space="preserve">Figure 2. Uncertainty propagation across the source–sewer–measurement–normalization–reconstruction chain, with the §8.13 law-of-total-variance decomposition indicated at each stage.</w:t>
       </w:r>
     </w:p>
     <w:p>
@@ -26014,14 +26014,14 @@
       <w:r>
         <w:drawing>
           <wp:inline>
-            <wp:extent cx="5334000" cy="5333999"/>
+            <wp:extent cx="6667500" cy="6667500"/>
             <wp:effectExtent b="0" l="0" r="0" t="0"/>
-            <wp:docPr descr="Figure 4. Uncertainty budget and correlated-parameter network, summarizing Table 6’s dependency structure." title="" id="94" name="Picture"/>
+            <wp:docPr descr="Figure 3. Uncertainty budget and correlated-parameter network, summarizing Table 6’s dependency structure." title="" id="94" name="Picture"/>
             <a:graphic>
               <a:graphicData uri="http://schemas.openxmlformats.org/drawingml/2006/picture">
                 <pic:pic>
                   <pic:nvPicPr>
-                    <pic:cNvPr descr="WBE_Fig4_Uncertainty_Budget_Network.png" id="95" name="Picture"/>
+                    <pic:cNvPr descr="WBE_Fig3_Uncertainty_Budget_Network.png" id="95" name="Picture"/>
                     <pic:cNvPicPr>
                       <a:picLocks noChangeArrowheads="1" noChangeAspect="1"/>
                     </pic:cNvPicPr>
@@ -26035,7 +26035,7 @@
                   <pic:spPr bwMode="auto">
                     <a:xfrm>
                       <a:off x="0" y="0"/>
-                      <a:ext cx="5334000" cy="5333999"/>
+                      <a:ext cx="6667500" cy="6667500"/>
                     </a:xfrm>
                     <a:prstGeom prst="rect">
                       <a:avLst/>
@@ -26059,7 +26059,7 @@
         <w:pStyle w:val="ImageCaption"/>
       </w:pPr>
       <w:r>
-        <w:t xml:space="preserve">Figure 4. Uncertainty budget and correlated-parameter network, summarizing Table 6’s dependency structure.</w:t>
+        <w:t xml:space="preserve">Figure 3. Uncertainty budget and correlated-parameter network, summarizing Table 6’s dependency structure.</w:t>
       </w:r>
     </w:p>
     <w:p>
@@ -26174,7 +26174,19 @@
         <w:t xml:space="preserve"> </w:t>
       </w:r>
       <w:r>
-        <w:t xml:space="preserve">— complete reference list (author, year, title, journal, volume/issue/pages, DOI) for every source cited above, including the three sources added for Chapter 8 ([46]–[48]).</w:t>
+        <w:t xml:space="preserve">— complete reference list (author, year, title, journal, volume/issue/pages, DOI) for every source cited above, including the five sources added for Chapter 8 ([46]–[50]) (also delivered as</w:t>
+      </w:r>
+      <w:r>
+        <w:t xml:space="preserve"> </w:t>
+      </w:r>
+      <w:r>
+        <w:rPr>
+          <w:rStyle w:val="VerbatimChar"/>
+        </w:rPr>
+        <w:t xml:space="preserve">.docx</w:t>
+      </w:r>
+      <w:r>
+        <w:t xml:space="preserve">).</w:t>
       </w:r>
     </w:p>
     <w:p>
@@ -26197,7 +26209,19 @@
         <w:t xml:space="preserve"> </w:t>
       </w:r>
       <w:r>
-        <w:t xml:space="preserve">— per-citation table of evidence type, DOI/link, the specific claim each source supports in the text above, and verification status, updated for Chapter 8.</w:t>
+        <w:t xml:space="preserve">— per-citation table of evidence type, DOI/link, the specific claim each source supports in the text above, and verification status, updated for Chapter 8 (also delivered as</w:t>
+      </w:r>
+      <w:r>
+        <w:t xml:space="preserve"> </w:t>
+      </w:r>
+      <w:r>
+        <w:rPr>
+          <w:rStyle w:val="VerbatimChar"/>
+        </w:rPr>
+        <w:t xml:space="preserve">.docx</w:t>
+      </w:r>
+      <w:r>
+        <w:t xml:space="preserve">).</w:t>
       </w:r>
     </w:p>
     <w:p>
@@ -26220,7 +26244,19 @@
         <w:t xml:space="preserve"> </w:t>
       </w:r>
       <w:r>
-        <w:t xml:space="preserve">— consolidated list of every number and claim across Chapters 1–8 still awaiting full-text verification, including a new Chapter 8 section on probability distributions and parameter ranges.</w:t>
+        <w:t xml:space="preserve">— consolidated list of every number and claim across Chapters 1–8 still awaiting full-text verification, including a new Chapter 8 section on probability distributions and parameter ranges (also delivered as</w:t>
+      </w:r>
+      <w:r>
+        <w:t xml:space="preserve"> </w:t>
+      </w:r>
+      <w:r>
+        <w:rPr>
+          <w:rStyle w:val="VerbatimChar"/>
+        </w:rPr>
+        <w:t xml:space="preserve">.docx</w:t>
+      </w:r>
+      <w:r>
+        <w:t xml:space="preserve">).</w:t>
       </w:r>
     </w:p>
     <w:p>
@@ -26237,7 +26273,7 @@
           <w:bCs/>
           <w:b/>
         </w:rPr>
-        <w:t xml:space="preserve">WBE_Fig2_Normalization_Decision_Tree.png</w:t>
+        <w:t xml:space="preserve">WBE_Fig1_Normalization_Decision_Tree.png</w:t>
       </w:r>
       <w:r>
         <w:t xml:space="preserve"> </w:t>
@@ -26260,13 +26296,13 @@
           <w:bCs/>
           <w:b/>
         </w:rPr>
-        <w:t xml:space="preserve">WBE_Fig3_Uncertainty_Chain.png</w:t>
-      </w:r>
-      <w:r>
-        <w:t xml:space="preserve"> </w:t>
-      </w:r>
-      <w:r>
-        <w:t xml:space="preserve">— the §8 uncertainty-propagation chain diagram (Figure 3).</w:t>
+        <w:t xml:space="preserve">WBE_Fig2_Uncertainty_Chain.png</w:t>
+      </w:r>
+      <w:r>
+        <w:t xml:space="preserve"> </w:t>
+      </w:r>
+      <w:r>
+        <w:t xml:space="preserve">— the §8 uncertainty-propagation chain diagram (Figure 2).</w:t>
       </w:r>
     </w:p>
     <w:p>
@@ -26283,13 +26319,13 @@
           <w:bCs/>
           <w:b/>
         </w:rPr>
-        <w:t xml:space="preserve">WBE_Fig4_Uncertainty_Budget_Network.png</w:t>
-      </w:r>
-      <w:r>
-        <w:t xml:space="preserve"> </w:t>
-      </w:r>
-      <w:r>
-        <w:t xml:space="preserve">— the §8.10 correlated-parameter network diagram (Figure 4).</w:t>
+        <w:t xml:space="preserve">WBE_Fig3_Uncertainty_Budget_Network.png</w:t>
+      </w:r>
+      <w:r>
+        <w:t xml:space="preserve"> </w:t>
+      </w:r>
+      <w:r>
+        <w:t xml:space="preserve">— the §8.10 correlated-parameter network diagram (Figure 3).</w:t>
       </w:r>
     </w:p>
     <w:p>
@@ -26312,7 +26348,112 @@
         <w:t xml:space="preserve"> </w:t>
       </w:r>
       <w:r>
-        <w:t xml:space="preserve">— sourcing and evidence-balance audit specific to Chapter 8 (parameter-correlation handling, structural-uncertainty propagation, and coverage/external validation tracked per study).</w:t>
+        <w:t xml:space="preserve">— sourcing and evidence-balance audit specific to Chapter 8 (parameter-correlation handling, structural-uncertainty propagation, and coverage/external validation tracked per study) (also delivered as</w:t>
+      </w:r>
+      <w:r>
+        <w:t xml:space="preserve"> </w:t>
+      </w:r>
+      <w:r>
+        <w:rPr>
+          <w:rStyle w:val="VerbatimChar"/>
+        </w:rPr>
+        <w:t xml:space="preserve">.docx</w:t>
+      </w:r>
+      <w:r>
+        <w:t xml:space="preserve">).</w:t>
+      </w:r>
+    </w:p>
+    <w:p>
+      <w:pPr>
+        <w:numPr>
+          <w:ilvl w:val="0"/>
+          <w:numId w:val="1027"/>
+        </w:numPr>
+        <w:pStyle w:val="Compact"/>
+      </w:pPr>
+      <w:r>
+        <w:rPr>
+          <w:rStyle w:val="VerbatimChar"/>
+          <w:bCs/>
+          <w:b/>
+        </w:rPr>
+        <w:t xml:space="preserve">WBE_Review_Ch7_Model_Audit_Table.md</w:t>
+      </w:r>
+      <w:r>
+        <w:t xml:space="preserve"> </w:t>
+      </w:r>
+      <w:r>
+        <w:t xml:space="preserve">— Chapter 7’s Table 4 (five-way framework by method family) and Table 5 (eight-attribute per-study audit), extracted as a standalone file (also delivered as</w:t>
+      </w:r>
+      <w:r>
+        <w:t xml:space="preserve"> </w:t>
+      </w:r>
+      <w:r>
+        <w:rPr>
+          <w:rStyle w:val="VerbatimChar"/>
+        </w:rPr>
+        <w:t xml:space="preserve">.docx</w:t>
+      </w:r>
+      <w:r>
+        <w:t xml:space="preserve">).</w:t>
+      </w:r>
+    </w:p>
+    <w:p>
+      <w:pPr>
+        <w:numPr>
+          <w:ilvl w:val="0"/>
+          <w:numId w:val="1027"/>
+        </w:numPr>
+        <w:pStyle w:val="Compact"/>
+      </w:pPr>
+      <w:r>
+        <w:rPr>
+          <w:rStyle w:val="VerbatimChar"/>
+          <w:bCs/>
+          <w:b/>
+        </w:rPr>
+        <w:t xml:space="preserve">WBE_Review_Ch8_Parameter_Distribution_Table.md</w:t>
+      </w:r>
+      <w:r>
+        <w:t xml:space="preserve"> </w:t>
+      </w:r>
+      <w:r>
+        <w:t xml:space="preserve">— Chapter 8’s Table 6 (parameter–distribution–source–correlation summary) plus the §8.10 named-dependency table, extracted as a standalone file (also delivered as</w:t>
+      </w:r>
+      <w:r>
+        <w:t xml:space="preserve"> </w:t>
+      </w:r>
+      <w:r>
+        <w:rPr>
+          <w:rStyle w:val="VerbatimChar"/>
+        </w:rPr>
+        <w:t xml:space="preserve">.docx</w:t>
+      </w:r>
+      <w:r>
+        <w:t xml:space="preserve">).</w:t>
+      </w:r>
+    </w:p>
+    <w:p>
+      <w:pPr>
+        <w:numPr>
+          <w:ilvl w:val="0"/>
+          <w:numId w:val="1027"/>
+        </w:numPr>
+        <w:pStyle w:val="Compact"/>
+      </w:pPr>
+      <w:r>
+        <w:rPr>
+          <w:rStyle w:val="VerbatimChar"/>
+          <w:bCs/>
+          <w:b/>
+        </w:rPr>
+        <w:t xml:space="preserve">WBE_Review_Ch8_Evidence_Freeze_Audit.md</w:t>
+      </w:r>
+      <w:r>
+        <w:t xml:space="preserve"> </w:t>
+      </w:r>
+      <w:r>
+        <w:t xml:space="preserve">— per-chapter count of primary WBE studies, systematic reviews, general methodological sources, full-text-read sources, abstract/metadata-only sources, and paragraphs without a specific citation.</w:t>
       </w:r>
     </w:p>
     <w:p>
@@ -28501,7 +28642,10 @@
     </w:p>
     <w:bookmarkEnd w:id="103"/>
     <w:bookmarkEnd w:id="104"/>
-    <w:sectPr/>
+    <w:sectPr>
+      <w:pgSz w:h="15840" w:w="12240"/>
+      <w:pgMar w:bottom="1008" w:left="864" w:right="864" w:top="1008"/>
+    </w:sectPr>
   </w:body>
 </w:document>
 </file>

</xml_diff>